<commit_message>
Add masking/trust demo scenario (9) with fake-requisites contract
New retail demo asset for testing recommendation #2 from the mz-arsenal
account (lead with masking -> employee-trust on the next demo): a fake
supply contract with bank requisites, signatory contacts, and an
explicit Гарантийные обязательства article with concrete numeric terms
to mask. Wired in as Scenario 9 across scenarios.md and dataset/README.md
(hard vs soft masking vs authorized-role comparison, expected answers),
and cross-linked from the account's next-meeting-prep so the team can
run it as-is instead of improvising an example live.
</commit_message>
<xml_diff>
--- a/docs/accounts/mz-arsenal/next-meeting-prep.docx
+++ b/docs/accounts/mz-arsenal/next-meeting-prep.docx
@@ -316,6 +316,33 @@
           <w:szCs w:val="22"/>
         </w:rPr>
         <w:t xml:space="preserve">Начать демо не со слайда «наша платформа умеет...», а с живого прогона: загрузить демонстрационный договор с гарантийными условиями и реквизитами → показать, как шлюз заменяет их на метки перед отправкой в облачную модель → показать ответ модели → показать, что сотрудник видит в интерфейсе явную пометку «этот блок был скрыт политикой безопасности», а не тихий пробел.</w:t>
+      </w:r>
+    </w:p>
+    <w:p>
+      <w:pPr>
+        <w:spacing w:after="40" w:before="120"/>
+      </w:pPr>
+      <w:r>
+        <w:rPr>
+          <w:b/>
+          <w:bCs/>
+          <w:color w:val="E87A1E"/>
+          <w:sz w:val="18"/>
+          <w:szCs w:val="18"/>
+        </w:rPr>
+        <w:t xml:space="preserve">ГОТОВЫЙ ДЕМО-АКТИВ</w:t>
+      </w:r>
+    </w:p>
+    <w:p>
+      <w:pPr>
+        <w:spacing w:after="160"/>
+      </w:pPr>
+      <w:r>
+        <w:rPr>
+          <w:sz w:val="22"/>
+          <w:szCs w:val="22"/>
+        </w:rPr>
+        <w:t xml:space="preserve">Договор с фейковыми реквизитами уже подготовлен: docs/demo-retail/dataset/01-postavshiki/dogovor-postavki-tehnika-garantiya.docx — банковские реквизиты, ФИО и контакты сторон, отдельная статья «Гарантийные обязательства» с конкретными числовыми условиями (гарантия 24 месяца, что её аннулирует, сроки реакции поставщика). Полный сценарий проверки — жёсткое vs мягкое маскирование vs авторизованная роль, с ожидаемыми ответами — оформлен как Сценарий 9 в docs/demo-retail/scenarios.md и docs/demo-retail/dataset/README.md. Не нужно придумывать пример на ходу — прогнать этот сценарий буквально.</w:t>
       </w:r>
     </w:p>
     <w:tbl>

</xml_diff>